<commit_message>
added skill to agente
</commit_message>
<xml_diff>
--- a/Modul 4 Copilot Prompting/Corporate-Wording-Guideline-allgemein.docx
+++ b/Modul 4 Copilot Prompting/Corporate-Wording-Guideline-allgemein.docx
@@ -1,6 +1,6 @@
 
 <file path=word/document.xml><?xml version="1.0" encoding="utf-8"?>
-<w:document xmlns:wpc="http://schemas.microsoft.com/office/word/2010/wordprocessingCanvas" xmlns:cx="http://schemas.microsoft.com/office/drawing/2014/chartex" xmlns:cx1="http://schemas.microsoft.com/office/drawing/2015/9/8/chartex" xmlns:cx2="http://schemas.microsoft.com/office/drawing/2015/10/21/chartex" xmlns:cx3="http://schemas.microsoft.com/office/drawing/2016/5/9/chartex" xmlns:cx4="http://schemas.microsoft.com/office/drawing/2016/5/10/chartex" xmlns:cx5="http://schemas.microsoft.com/office/drawing/2016/5/11/chartex" xmlns:cx6="http://schemas.microsoft.com/office/drawing/2016/5/12/chartex" xmlns:cx7="http://schemas.microsoft.com/office/drawing/2016/5/13/chartex" xmlns:cx8="http://schemas.microsoft.com/office/drawing/2016/5/14/chartex" xmlns:mc="http://schemas.openxmlformats.org/markup-compatibility/2006" xmlns:aink="http://schemas.microsoft.com/office/drawing/2016/ink" xmlns:am3d="http://schemas.microsoft.com/office/drawing/2017/model3d" xmlns:o="urn:schemas-microsoft-com:office:office" xmlns:oel="http://schemas.microsoft.com/office/2019/extlst" xmlns:r="http://schemas.openxmlformats.org/officeDocument/2006/relationships" xmlns:m="http://schemas.openxmlformats.org/officeDocument/2006/math" xmlns:v="urn:schemas-microsoft-com:vml" xmlns:wp14="http://schemas.microsoft.com/office/word/2010/wordprocessingDrawing" xmlns:wp="http://schemas.openxmlformats.org/drawingml/2006/wordprocessingDrawing" xmlns:w10="urn:schemas-microsoft-com:office:word" xmlns:w="http://schemas.openxmlformats.org/wordprocessingml/2006/main" xmlns:w14="http://schemas.microsoft.com/office/word/2010/wordml" xmlns:w15="http://schemas.microsoft.com/office/word/2012/wordml" xmlns:w16cei="http://schemas.microsoft.com/office/word/2026/wordml/cei" xmlns:w16cex="http://schemas.microsoft.com/office/word/2018/wordml/cex" xmlns:w16cid="http://schemas.microsoft.com/office/word/2016/wordml/cid" xmlns:w16="http://schemas.microsoft.com/office/word/2018/wordml" xmlns:w16du="http://schemas.microsoft.com/office/word/2023/wordml/word16du" xmlns:w16sdtdh="http://schemas.microsoft.com/office/word/2020/wordml/sdtdatahash" xmlns:w16sdtfl="http://schemas.microsoft.com/office/word/2024/wordml/sdtformatlock" xmlns:w16se="http://schemas.microsoft.com/office/word/2015/wordml/symex" xmlns:wpg="http://schemas.microsoft.com/office/word/2010/wordprocessingGroup" xmlns:wpi="http://schemas.microsoft.com/office/word/2010/wordprocessingInk" xmlns:wne="http://schemas.microsoft.com/office/word/2006/wordml" xmlns:wps="http://schemas.microsoft.com/office/word/2010/wordprocessingShape" mc:Ignorable="w14 w15 w16se w16cid w16 w16cex w16sdtdh w16sdtfl w16du wp14">
+<w:document xmlns:wpc="http://schemas.microsoft.com/office/word/2010/wordprocessingCanvas" xmlns:cx="http://schemas.microsoft.com/office/drawing/2014/chartex" xmlns:cx1="http://schemas.microsoft.com/office/drawing/2015/9/8/chartex" xmlns:cx2="http://schemas.microsoft.com/office/drawing/2015/10/21/chartex" xmlns:cx3="http://schemas.microsoft.com/office/drawing/2016/5/9/chartex" xmlns:cx4="http://schemas.microsoft.com/office/drawing/2016/5/10/chartex" xmlns:cx5="http://schemas.microsoft.com/office/drawing/2016/5/11/chartex" xmlns:cx6="http://schemas.microsoft.com/office/drawing/2016/5/12/chartex" xmlns:cx7="http://schemas.microsoft.com/office/drawing/2016/5/13/chartex" xmlns:cx8="http://schemas.microsoft.com/office/drawing/2016/5/14/chartex" xmlns:mc="http://schemas.openxmlformats.org/markup-compatibility/2006" xmlns:aink="http://schemas.microsoft.com/office/drawing/2016/ink" xmlns:am3d="http://schemas.microsoft.com/office/drawing/2017/model3d" xmlns:o="urn:schemas-microsoft-com:office:office" xmlns:oel="http://schemas.microsoft.com/office/2019/extlst" xmlns:r="http://schemas.openxmlformats.org/officeDocument/2006/relationships" xmlns:m="http://schemas.openxmlformats.org/officeDocument/2006/math" xmlns:v="urn:schemas-microsoft-com:vml" xmlns:wp14="http://schemas.microsoft.com/office/word/2010/wordprocessingDrawing" xmlns:wp="http://schemas.openxmlformats.org/drawingml/2006/wordprocessingDrawing" xmlns:w10="urn:schemas-microsoft-com:office:word" xmlns:w="http://schemas.openxmlformats.org/wordprocessingml/2006/main" xmlns:w14="http://schemas.microsoft.com/office/word/2010/wordml" xmlns:w15="http://schemas.microsoft.com/office/word/2012/wordml" xmlns:w16cex="http://schemas.microsoft.com/office/word/2018/wordml/cex" xmlns:w16cid="http://schemas.microsoft.com/office/word/2016/wordml/cid" xmlns:w16="http://schemas.microsoft.com/office/word/2018/wordml" xmlns:w16du="http://schemas.microsoft.com/office/word/2023/wordml/word16du" xmlns:w16sdtdh="http://schemas.microsoft.com/office/word/2020/wordml/sdtdatahash" xmlns:w16sdtfl="http://schemas.microsoft.com/office/word/2024/wordml/sdtformatlock" xmlns:w16se="http://schemas.microsoft.com/office/word/2015/wordml/symex" xmlns:wpg="http://schemas.microsoft.com/office/word/2010/wordprocessingGroup" xmlns:wpi="http://schemas.microsoft.com/office/word/2010/wordprocessingInk" xmlns:wne="http://schemas.microsoft.com/office/word/2006/wordml" xmlns:wps="http://schemas.microsoft.com/office/word/2010/wordprocessingShape" mc:Ignorable="w14 w15 w16se w16cid w16 w16cex w16sdtdh w16sdtfl w16du wp14">
   <w:body>
     <w:p>
       <w:pPr>
@@ -246,32 +246,67 @@
     </w:p>
     <w:p>
       <w:pPr>
-        <w:rPr>
-          <w:lang w:val="de-DE"/>
-        </w:rPr>
-      </w:pPr>
-      <w:r>
-        <w:rPr>
-          <w:rFonts w:ascii="Aptos" w:eastAsia="Aptos" w:hAnsi="Aptos" w:cs="Aptos"/>
+        <w:pStyle w:val="Normal"/>
+        <w:rPr>
+          <w:rFonts w:eastAsia="Aptos" w:cs="Aptos"/>
+        </w:rPr>
+      </w:pPr>
+      <w:r>
+        <w:rPr>
+          <w:rFonts w:eastAsia="Aptos" w:cs="Aptos"/>
           <w:b/>
           <w:bCs/>
-          <w:lang w:val="de-DE"/>
-        </w:rPr>
-        <w:t>Beispiel:</w:t>
-      </w:r>
-      <w:r>
-        <w:rPr>
-          <w:lang w:val="de-DE"/>
-        </w:rPr>
+        </w:rPr>
+        <w:t>Beispiel</w:t>
+      </w:r>
+      <w:r>
+        <w:rPr>
+          <w:rFonts w:eastAsia="Aptos" w:cs="Aptos"/>
+          <w:b/>
+          <w:bCs/>
+        </w:rPr>
+        <w:t>e</w:t>
+      </w:r>
+      <w:r>
+        <w:rPr>
+          <w:rFonts w:eastAsia="Aptos" w:cs="Aptos"/>
+          <w:b/>
+          <w:bCs/>
+        </w:rPr>
+        <w:t>:</w:t>
+      </w:r>
+      <w:r>
         <w:br/>
       </w:r>
       <w:r>
         <w:rPr>
-          <w:rFonts w:ascii="Aptos" w:eastAsia="Aptos" w:hAnsi="Aptos" w:cs="Aptos"/>
-          <w:lang w:val="de-DE"/>
+          <w:rFonts w:eastAsia="Aptos" w:cs="Aptos"/>
         </w:rPr>
         <w:t xml:space="preserve"> „Hier finden Sie Informationen zu Fördermöglichkeiten, Beratungsterminen und passenden Ansprechpartnern.“</w:t>
       </w:r>
+    </w:p>
+    <w:p>
+      <w:pPr>
+        <w:pStyle w:val="Normal"/>
+      </w:pPr>
+      <w:r>
+        <w:br/>
+        <w:t>„Aus einer ersten Idee kann ein tragfähiges Vorhaben werden. Wir zeigen, welche Angebote Orientierung geben und wo der nächste Schritt beginnt.“</w:t>
+      </w:r>
+    </w:p>
+    <w:p>
+      <w:pPr>
+        <w:pStyle w:val="Normal"/>
+      </w:pPr>
+      <w:r>
+        <w:br/>
+        <w:t>„Wenn aus Fragen konkrete Pläne werden, unterstützt das Angebot mit Überblick, Kontakten und passenden Informationen.“</w:t>
+      </w:r>
+    </w:p>
+    <w:p>
+      <w:pPr>
+        <w:pStyle w:val="Normal"/>
+      </w:pPr>
     </w:p>
     <w:p>
       <w:pPr>
@@ -369,6 +404,7 @@
           <w:rFonts w:ascii="Aptos" w:eastAsia="Aptos" w:hAnsi="Aptos" w:cs="Aptos"/>
           <w:lang w:val="de-DE"/>
         </w:rPr>
+        <w:lastRenderedPageBreak/>
         <w:t xml:space="preserve">Relevanz für Wirtschaft oder Region erklären </w:t>
       </w:r>
     </w:p>
@@ -470,7 +506,6 @@
           <w:sz w:val="24"/>
           <w:szCs w:val="24"/>
         </w:rPr>
-        <w:lastRenderedPageBreak/>
         <w:t>4. Wortwahl</w:t>
       </w:r>
     </w:p>
@@ -2226,7 +2261,7 @@
 </file>
 
 <file path=word/numbering.xml><?xml version="1.0" encoding="utf-8"?>
-<w:numbering xmlns:wpc="http://schemas.microsoft.com/office/word/2010/wordprocessingCanvas" xmlns:cx="http://schemas.microsoft.com/office/drawing/2014/chartex" xmlns:cx1="http://schemas.microsoft.com/office/drawing/2015/9/8/chartex" xmlns:cx2="http://schemas.microsoft.com/office/drawing/2015/10/21/chartex" xmlns:cx3="http://schemas.microsoft.com/office/drawing/2016/5/9/chartex" xmlns:cx4="http://schemas.microsoft.com/office/drawing/2016/5/10/chartex" xmlns:cx5="http://schemas.microsoft.com/office/drawing/2016/5/11/chartex" xmlns:cx6="http://schemas.microsoft.com/office/drawing/2016/5/12/chartex" xmlns:cx7="http://schemas.microsoft.com/office/drawing/2016/5/13/chartex" xmlns:cx8="http://schemas.microsoft.com/office/drawing/2016/5/14/chartex" xmlns:mc="http://schemas.openxmlformats.org/markup-compatibility/2006" xmlns:aink="http://schemas.microsoft.com/office/drawing/2016/ink" xmlns:am3d="http://schemas.microsoft.com/office/drawing/2017/model3d" xmlns:o="urn:schemas-microsoft-com:office:office" xmlns:oel="http://schemas.microsoft.com/office/2019/extlst" xmlns:r="http://schemas.openxmlformats.org/officeDocument/2006/relationships" xmlns:m="http://schemas.openxmlformats.org/officeDocument/2006/math" xmlns:v="urn:schemas-microsoft-com:vml" xmlns:wp14="http://schemas.microsoft.com/office/word/2010/wordprocessingDrawing" xmlns:wp="http://schemas.openxmlformats.org/drawingml/2006/wordprocessingDrawing" xmlns:w10="urn:schemas-microsoft-com:office:word" xmlns:w="http://schemas.openxmlformats.org/wordprocessingml/2006/main" xmlns:w14="http://schemas.microsoft.com/office/word/2010/wordml" xmlns:w15="http://schemas.microsoft.com/office/word/2012/wordml" xmlns:w16cei="http://schemas.microsoft.com/office/word/2026/wordml/cei" xmlns:w16cex="http://schemas.microsoft.com/office/word/2018/wordml/cex" xmlns:w16cid="http://schemas.microsoft.com/office/word/2016/wordml/cid" xmlns:w16="http://schemas.microsoft.com/office/word/2018/wordml" xmlns:w16du="http://schemas.microsoft.com/office/word/2023/wordml/word16du" xmlns:w16sdtdh="http://schemas.microsoft.com/office/word/2020/wordml/sdtdatahash" xmlns:w16sdtfl="http://schemas.microsoft.com/office/word/2024/wordml/sdtformatlock" xmlns:w16se="http://schemas.microsoft.com/office/word/2015/wordml/symex" xmlns:wpg="http://schemas.microsoft.com/office/word/2010/wordprocessingGroup" xmlns:wpi="http://schemas.microsoft.com/office/word/2010/wordprocessingInk" xmlns:wne="http://schemas.microsoft.com/office/word/2006/wordml" xmlns:wps="http://schemas.microsoft.com/office/word/2010/wordprocessingShape" mc:Ignorable="w14 w15 w16se w16cid w16 w16cex w16sdtdh w16sdtfl w16du wp14">
+<w:numbering xmlns:wpc="http://schemas.microsoft.com/office/word/2010/wordprocessingCanvas" xmlns:cx="http://schemas.microsoft.com/office/drawing/2014/chartex" xmlns:cx1="http://schemas.microsoft.com/office/drawing/2015/9/8/chartex" xmlns:cx2="http://schemas.microsoft.com/office/drawing/2015/10/21/chartex" xmlns:cx3="http://schemas.microsoft.com/office/drawing/2016/5/9/chartex" xmlns:cx4="http://schemas.microsoft.com/office/drawing/2016/5/10/chartex" xmlns:cx5="http://schemas.microsoft.com/office/drawing/2016/5/11/chartex" xmlns:cx6="http://schemas.microsoft.com/office/drawing/2016/5/12/chartex" xmlns:cx7="http://schemas.microsoft.com/office/drawing/2016/5/13/chartex" xmlns:cx8="http://schemas.microsoft.com/office/drawing/2016/5/14/chartex" xmlns:mc="http://schemas.openxmlformats.org/markup-compatibility/2006" xmlns:aink="http://schemas.microsoft.com/office/drawing/2016/ink" xmlns:am3d="http://schemas.microsoft.com/office/drawing/2017/model3d" xmlns:o="urn:schemas-microsoft-com:office:office" xmlns:oel="http://schemas.microsoft.com/office/2019/extlst" xmlns:r="http://schemas.openxmlformats.org/officeDocument/2006/relationships" xmlns:m="http://schemas.openxmlformats.org/officeDocument/2006/math" xmlns:v="urn:schemas-microsoft-com:vml" xmlns:wp14="http://schemas.microsoft.com/office/word/2010/wordprocessingDrawing" xmlns:wp="http://schemas.openxmlformats.org/drawingml/2006/wordprocessingDrawing" xmlns:w10="urn:schemas-microsoft-com:office:word" xmlns:w="http://schemas.openxmlformats.org/wordprocessingml/2006/main" xmlns:w14="http://schemas.microsoft.com/office/word/2010/wordml" xmlns:w15="http://schemas.microsoft.com/office/word/2012/wordml" xmlns:w16cex="http://schemas.microsoft.com/office/word/2018/wordml/cex" xmlns:w16cid="http://schemas.microsoft.com/office/word/2016/wordml/cid" xmlns:w16="http://schemas.microsoft.com/office/word/2018/wordml" xmlns:w16du="http://schemas.microsoft.com/office/word/2023/wordml/word16du" xmlns:w16sdtdh="http://schemas.microsoft.com/office/word/2020/wordml/sdtdatahash" xmlns:w16sdtfl="http://schemas.microsoft.com/office/word/2024/wordml/sdtformatlock" xmlns:w16se="http://schemas.microsoft.com/office/word/2015/wordml/symex" xmlns:wpg="http://schemas.microsoft.com/office/word/2010/wordprocessingGroup" xmlns:wpi="http://schemas.microsoft.com/office/word/2010/wordprocessingInk" xmlns:wne="http://schemas.microsoft.com/office/word/2006/wordml" xmlns:wps="http://schemas.microsoft.com/office/word/2010/wordprocessingShape" mc:Ignorable="w14 w15 w16se w16cid w16 w16cex w16sdtdh w16sdtfl w16du wp14">
   <w:abstractNum w:abstractNumId="0" w15:restartNumberingAfterBreak="0">
     <w:nsid w:val="2DB8F78A"/>
     <w:multiLevelType w:val="hybridMultilevel"/>
@@ -3340,6 +3375,19 @@
       </w:tblBorders>
     </w:tblPr>
   </w:style>
+  <w:style w:type="paragraph" w:customStyle="1" w:styleId="Normal">
+    <w:name w:val="Normal"/>
+    <w:basedOn w:val="Standard"/>
+    <w:pPr>
+      <w:spacing w:line="278" w:lineRule="auto"/>
+    </w:pPr>
+    <w:rPr>
+      <w:rFonts w:ascii="Aptos" w:hAnsi="Aptos" w:cs="Times New Roman"/>
+      <w:kern w:val="2"/>
+      <w:lang w:val="de-DE" w:eastAsia="de-DE"/>
+      <w14:ligatures w14:val="standardContextual"/>
+    </w:rPr>
+  </w:style>
 </w:styles>
 </file>
 
@@ -3605,6 +3653,21 @@
 </file>
 
 <file path=customXml/item1.xml><?xml version="1.0" encoding="utf-8"?>
+<p:properties xmlns:p="http://schemas.microsoft.com/office/2006/metadata/properties" xmlns:xsi="http://www.w3.org/2001/XMLSchema-instance" xmlns:pc="http://schemas.microsoft.com/office/infopath/2007/PartnerControls">
+  <documentManagement/>
+</p:properties>
+</file>
+
+<file path=customXml/item2.xml><?xml version="1.0" encoding="utf-8"?>
+<?mso-contentType ?>
+<FormTemplates xmlns="http://schemas.microsoft.com/sharepoint/v3/contenttype/forms">
+  <Display>DocumentLibraryForm</Display>
+  <Edit>DocumentLibraryForm</Edit>
+  <New>DocumentLibraryForm</New>
+</FormTemplates>
+</file>
+
+<file path=customXml/item3.xml><?xml version="1.0" encoding="utf-8"?>
 <ct:contentTypeSchema xmlns:ct="http://schemas.microsoft.com/office/2006/metadata/contentType" xmlns:ma="http://schemas.microsoft.com/office/2006/metadata/properties/metaAttributes" ct:_="" ma:_="" ma:contentTypeName="Dokument" ma:contentTypeID="0x010100E6138A63FEFB5C45AAA1B4B0E368BC96" ma:contentTypeVersion="0" ma:contentTypeDescription="Ein neues Dokument erstellen." ma:contentTypeScope="" ma:versionID="11f3428142aba750388ea637c3f69e84">
   <xsd:schema xmlns:xsd="http://www.w3.org/2001/XMLSchema" xmlns:xs="http://www.w3.org/2001/XMLSchema" xmlns:p="http://schemas.microsoft.com/office/2006/metadata/properties" targetNamespace="http://schemas.microsoft.com/office/2006/metadata/properties" ma:root="true" ma:fieldsID="df7b5bc1abea3a6eee9d75eaf0ff079b">
     <xsd:element name="properties">
@@ -3718,32 +3781,10 @@
 </ct:contentTypeSchema>
 </file>
 
-<file path=customXml/item2.xml><?xml version="1.0" encoding="utf-8"?>
-<?mso-contentType ?>
-<FormTemplates xmlns="http://schemas.microsoft.com/sharepoint/v3/contenttype/forms">
-  <Display>DocumentLibraryForm</Display>
-  <Edit>DocumentLibraryForm</Edit>
-  <New>DocumentLibraryForm</New>
-</FormTemplates>
-</file>
-
-<file path=customXml/item3.xml><?xml version="1.0" encoding="utf-8"?>
-<p:properties xmlns:p="http://schemas.microsoft.com/office/2006/metadata/properties" xmlns:xsi="http://www.w3.org/2001/XMLSchema-instance" xmlns:pc="http://schemas.microsoft.com/office/infopath/2007/PartnerControls">
-  <documentManagement/>
-</p:properties>
-</file>
-
 <file path=customXml/itemProps1.xml><?xml version="1.0" encoding="utf-8"?>
-<ds:datastoreItem xmlns:ds="http://schemas.openxmlformats.org/officeDocument/2006/customXml" ds:itemID="{A96115FF-F44B-4377-BF38-286127D04AEA}">
+<ds:datastoreItem xmlns:ds="http://schemas.openxmlformats.org/officeDocument/2006/customXml" ds:itemID="{E098C3FC-4326-4B53-ADE5-C5839076B162}">
   <ds:schemaRefs>
-    <ds:schemaRef ds:uri="http://schemas.microsoft.com/office/2006/metadata/contentType"/>
-    <ds:schemaRef ds:uri="http://schemas.microsoft.com/office/2006/metadata/properties/metaAttributes"/>
-    <ds:schemaRef ds:uri="http://www.w3.org/2001/XMLSchema"/>
     <ds:schemaRef ds:uri="http://schemas.microsoft.com/office/2006/metadata/properties"/>
-    <ds:schemaRef ds:uri="http://schemas.openxmlformats.org/package/2006/metadata/core-properties"/>
-    <ds:schemaRef ds:uri="http://purl.org/dc/elements/1.1/"/>
-    <ds:schemaRef ds:uri="http://purl.org/dc/terms/"/>
-    <ds:schemaRef ds:uri="http://schemas.microsoft.com/internal/obd"/>
     <ds:schemaRef ds:uri="http://schemas.microsoft.com/office/infopath/2007/PartnerControls"/>
   </ds:schemaRefs>
 </ds:datastoreItem>
@@ -3758,9 +3799,16 @@
 </file>
 
 <file path=customXml/itemProps3.xml><?xml version="1.0" encoding="utf-8"?>
-<ds:datastoreItem xmlns:ds="http://schemas.openxmlformats.org/officeDocument/2006/customXml" ds:itemID="{E098C3FC-4326-4B53-ADE5-C5839076B162}">
+<ds:datastoreItem xmlns:ds="http://schemas.openxmlformats.org/officeDocument/2006/customXml" ds:itemID="{A96115FF-F44B-4377-BF38-286127D04AEA}">
   <ds:schemaRefs>
+    <ds:schemaRef ds:uri="http://schemas.microsoft.com/office/2006/metadata/contentType"/>
+    <ds:schemaRef ds:uri="http://schemas.microsoft.com/office/2006/metadata/properties/metaAttributes"/>
+    <ds:schemaRef ds:uri="http://www.w3.org/2001/XMLSchema"/>
     <ds:schemaRef ds:uri="http://schemas.microsoft.com/office/2006/metadata/properties"/>
+    <ds:schemaRef ds:uri="http://schemas.openxmlformats.org/package/2006/metadata/core-properties"/>
+    <ds:schemaRef ds:uri="http://purl.org/dc/elements/1.1/"/>
+    <ds:schemaRef ds:uri="http://purl.org/dc/terms/"/>
+    <ds:schemaRef ds:uri="http://schemas.microsoft.com/internal/obd"/>
     <ds:schemaRef ds:uri="http://schemas.microsoft.com/office/infopath/2007/PartnerControls"/>
   </ds:schemaRefs>
 </ds:datastoreItem>

</xml_diff>